<commit_message>
Session 5 round 2: the take-home sheet on screen; Bobby Gore flags closed
The commissioning block now shows the actual take-home sheet across two
slides (the daily rhythm; the four parts), replacing the school-form H5.6
card image - the screen now matches the sheet in the room's hands. The
practice slide's stale card reference reworded. Leader Notes rebuilt from
the 15-slide deck. Pastor Gore's yes closes both open flags: number
phone-verified and after-hours protocol confirmed (launch checklist +
host profile). Adult/mentor note withdrawn by John - not found by either
of us. Deck and Leader Notes re-synced to FotH 2026.

Co-Authored-By: Claude Fable 5 <noreply@anthropic.com>
</commit_message>
<xml_diff>
--- a/_implementation-notes/evening-series/FotH Evening Session 5 Leader Notes DRAFT v1.docx
+++ b/_implementation-notes/evening-series/FotH Evening Session 5 Leader Notes DRAFT v1.docx
@@ -874,7 +874,7 @@
           <w:color w:val="2C5F2D"/>
           <w:sz w:val="24"/>
         </w:rPr>
-        <w:t>Slide 12 — Your Take-Home Card — This Week’s Practice</w:t>
+        <w:t>Slide 12 — The Take-Home Sheet — the Daily Rhythm</w:t>
       </w:r>
     </w:p>
     <w:p>
@@ -908,7 +908,7 @@
         <w:ind w:left="216"/>
       </w:pPr>
       <w:r>
-        <w:t>1. Check-off card (H5.6): daily morning question, evening note, and the one-condition practice; two one-time boxes.</w:t>
+        <w:t>1. The sheet on the screen is the sheet in their hands — walk it, don't read it.</w:t>
       </w:r>
     </w:p>
     <w:p>
@@ -916,7 +916,15 @@
         <w:ind w:left="216"/>
       </w:pPr>
       <w:r>
-        <w:t>2. A missed box is never a failure — it is an invitation to return.</w:t>
+        <w:t>2. The standing practice first: the morning question, the evening journal line — every day, both weeks; one box per day on the two week-grids.</w:t>
+      </w:r>
+    </w:p>
+    <w:p>
+      <w:pPr>
+        <w:ind w:left="216"/>
+      </w:pPr>
+      <w:r>
+        <w:t>3. A missed box is never a failure — it is an invitation to return.</w:t>
       </w:r>
     </w:p>
     <w:p>
@@ -931,7 +939,7 @@
         <w:t>CUES:</w:t>
       </w:r>
       <w:r>
-        <w:t xml:space="preserve"> Rides inside the practice block.</w:t>
+        <w:t xml:space="preserve"> Rides inside the commissioning block; the four parts are the next slide.</w:t>
       </w:r>
     </w:p>
     <w:p>
@@ -946,7 +954,79 @@
           <w:color w:val="2C5F2D"/>
           <w:sz w:val="24"/>
         </w:rPr>
-        <w:t>Slide 13 — The Leader Feedback Round</w:t>
+        <w:t>Slide 13 — The Take-Home Sheet — the Four Parts</w:t>
+      </w:r>
+    </w:p>
+    <w:p>
+      <w:pPr>
+        <w:keepNext/>
+        <w:spacing w:after="40"/>
+      </w:pPr>
+      <w:r>
+        <w:rPr>
+          <w:b/>
+          <w:color w:val="6B8E3F"/>
+          <w:sz w:val="18"/>
+        </w:rPr>
+        <w:t>S5 · 8:20–8:24 · LEAD: CONTENT PRESENTER</w:t>
+      </w:r>
+    </w:p>
+    <w:p>
+      <w:pPr>
+        <w:ind w:left="216"/>
+      </w:pPr>
+      <w:r>
+        <w:rPr>
+          <w:b/>
+          <w:color w:val="595959"/>
+        </w:rPr>
+        <w:t>BEATS:</w:t>
+      </w:r>
+    </w:p>
+    <w:p>
+      <w:pPr>
+        <w:ind w:left="216"/>
+      </w:pPr>
+      <w:r>
+        <w:t>1. The four parts, in order: the homework practice, week one (one friendship, one condition); the end-of-week-one check-in; the homework practice, week two (same friendship, second condition — or deeper); one sentence of preparation.</w:t>
+      </w:r>
+    </w:p>
+    <w:p>
+      <w:pPr>
+        <w:ind w:left="216"/>
+      </w:pPr>
+      <w:r>
+        <w:t>2. Check-in partners are named aloud before leaving this slide — the sheet has the line to write the name.</w:t>
+      </w:r>
+    </w:p>
+    <w:p>
+      <w:pPr>
+        <w:ind w:left="216"/>
+      </w:pPr>
+      <w:r>
+        <w:rPr>
+          <w:b/>
+          <w:color w:val="595959"/>
+        </w:rPr>
+        <w:t>GUARD:</w:t>
+      </w:r>
+      <w:r>
+        <w:t xml:space="preserve"> Do not reteach the practice here — the practice slide did that; this is the sheet-walk only.</w:t>
+      </w:r>
+    </w:p>
+    <w:p>
+      <w:pPr>
+        <w:keepNext/>
+        <w:spacing w:before="160" w:after="20"/>
+      </w:pPr>
+      <w:r>
+        <w:rPr>
+          <w:rFonts w:ascii="Cambria" w:hAnsi="Cambria"/>
+          <w:b/>
+          <w:color w:val="2C5F2D"/>
+          <w:sz w:val="24"/>
+        </w:rPr>
+        <w:t>Slide 14 — The Leader Feedback Round</w:t>
       </w:r>
     </w:p>
     <w:p>
@@ -1026,7 +1106,7 @@
           <w:color w:val="2C5F2D"/>
           <w:sz w:val="24"/>
         </w:rPr>
-        <w:t>Slide 14 — Closing the Container + Aaronic Blessing</w:t>
+        <w:t>Slide 15 — Closing the Container + Aaronic Blessing</w:t>
       </w:r>
     </w:p>
     <w:p>

</xml_diff>

<commit_message>
Session 5: 'More Than the Four' wrap-up at the merge's tail
New two-minute close from the content presenter after the merge: the four
conditions are foundational - what makes a close friendship possible -
but a good friend also gives you energy, leaves you uplifted, is warm and
caring, maybe even funny. And these are a way to choose which friendships
to deepen with this process and intentionality. New slide (deck now 16),
page table + leads bullet, run sheet table + changes item, leader notes
rebuilt; synced to FotH 2026.

Co-Authored-By: Claude Fable 5 <noreply@anthropic.com>
</commit_message>
<xml_diff>
--- a/_implementation-notes/evening-series/FotH Evening Session 5 Leader Notes DRAFT v1.docx
+++ b/_implementation-notes/evening-series/FotH Evening Session 5 Leader Notes DRAFT v1.docx
@@ -801,7 +801,87 @@
           <w:color w:val="2C5F2D"/>
           <w:sz w:val="24"/>
         </w:rPr>
-        <w:t>Slide 11 — The Homework Practice — One Friendship, One Condition</w:t>
+        <w:t>Slide 11 — More Than the Four</w:t>
+      </w:r>
+    </w:p>
+    <w:p>
+      <w:pPr>
+        <w:keepNext/>
+        <w:spacing w:after="40"/>
+      </w:pPr>
+      <w:r>
+        <w:rPr>
+          <w:b/>
+          <w:color w:val="6B8E3F"/>
+          <w:sz w:val="18"/>
+        </w:rPr>
+        <w:t>S5 · 8:18–8:20 · LEAD: CONTENT PRESENTER · WRAP-UP</w:t>
+      </w:r>
+    </w:p>
+    <w:p>
+      <w:pPr>
+        <w:ind w:left="216"/>
+      </w:pPr>
+      <w:r>
+        <w:rPr>
+          <w:b/>
+          <w:color w:val="595959"/>
+        </w:rPr>
+        <w:t>BEATS:</w:t>
+      </w:r>
+    </w:p>
+    <w:p>
+      <w:pPr>
+        <w:ind w:left="216"/>
+      </w:pPr>
+      <w:r>
+        <w:t>1. Name it plainly: the four conditions are foundational — they are what make a close friendship possible. They are not the whole of friendship.</w:t>
+      </w:r>
+    </w:p>
+    <w:p>
+      <w:pPr>
+        <w:ind w:left="216"/>
+      </w:pPr>
+      <w:r>
+        <w:t>2. A good friend also reaches you in other ways: they give you energy — you walk away uplifted; they are warm and caring; maybe even funny.</w:t>
+      </w:r>
+    </w:p>
+    <w:p>
+      <w:pPr>
+        <w:ind w:left="216"/>
+      </w:pPr>
+      <w:r>
+        <w:t>3. Turn it toward choice: these other gifts are a way to think about WHICH friendships you want to deepen — with the process and intentionality we have just walked. As you work your one friendship these two weeks, notice what else your good friendships give you.</w:t>
+      </w:r>
+    </w:p>
+    <w:p>
+      <w:pPr>
+        <w:ind w:left="216"/>
+      </w:pPr>
+      <w:r>
+        <w:rPr>
+          <w:b/>
+          <w:color w:val="595959"/>
+        </w:rPr>
+        <w:t>GUARD:</w:t>
+      </w:r>
+      <w:r>
+        <w:t xml:space="preserve"> Two minutes, riding the tail of the merge block — not a second teaching. The commissioning needs its time.</w:t>
+      </w:r>
+    </w:p>
+    <w:p>
+      <w:pPr>
+        <w:keepNext/>
+        <w:spacing w:before="160" w:after="20"/>
+      </w:pPr>
+      <w:r>
+        <w:rPr>
+          <w:rFonts w:ascii="Cambria" w:hAnsi="Cambria"/>
+          <w:b/>
+          <w:color w:val="2C5F2D"/>
+          <w:sz w:val="24"/>
+        </w:rPr>
+        <w:t>Slide 12 — The Homework Practice — One Friendship, One Condition</w:t>
       </w:r>
     </w:p>
     <w:p>
@@ -874,7 +954,7 @@
           <w:color w:val="2C5F2D"/>
           <w:sz w:val="24"/>
         </w:rPr>
-        <w:t>Slide 12 — The Take-Home Sheet — the Daily Rhythm</w:t>
+        <w:t>Slide 13 — The Take-Home Sheet — the Daily Rhythm</w:t>
       </w:r>
     </w:p>
     <w:p>
@@ -954,7 +1034,7 @@
           <w:color w:val="2C5F2D"/>
           <w:sz w:val="24"/>
         </w:rPr>
-        <w:t>Slide 13 — The Take-Home Sheet — the Four Parts</w:t>
+        <w:t>Slide 14 — The Take-Home Sheet — the Four Parts</w:t>
       </w:r>
     </w:p>
     <w:p>
@@ -1026,7 +1106,7 @@
           <w:color w:val="2C5F2D"/>
           <w:sz w:val="24"/>
         </w:rPr>
-        <w:t>Slide 14 — The Leader Feedback Round</w:t>
+        <w:t>Slide 15 — The Leader Feedback Round</w:t>
       </w:r>
     </w:p>
     <w:p>
@@ -1106,7 +1186,7 @@
           <w:color w:val="2C5F2D"/>
           <w:sz w:val="24"/>
         </w:rPr>
-        <w:t>Slide 15 — Closing the Container + Aaronic Blessing</w:t>
+        <w:t>Slide 16 — Closing the Container + Aaronic Blessing</w:t>
       </w:r>
     </w:p>
     <w:p>

</xml_diff>

<commit_message>
Session 5 deck: John's review round
Teaching slide retitled 'Friendship Mapping with Four Conditions';
cluster language settled to pairs throughout (bridge slide, notes) for
timing; small-number line demoted to a sub-bullet; quotes dropped from
the choice line on More Than the Four; interim corner numbers on the
three inserted slides (59a grounding, 66a wrap-up, 68a take-home part 2)
pending the master renumber at the series rebuild. Leader Notes rebuilt.

Co-Authored-By: Claude Fable 5 <noreply@anthropic.com>
</commit_message>
<xml_diff>
--- a/_implementation-notes/evening-series/FotH Evening Session 5 Leader Notes DRAFT v1.docx
+++ b/_implementation-notes/evening-series/FotH Evening Session 5 Leader Notes DRAFT v1.docx
@@ -413,7 +413,7 @@
           <w:color w:val="2C5F2D"/>
           <w:sz w:val="24"/>
         </w:rPr>
-        <w:t>Slide 7 — The Four Conditions</w:t>
+        <w:t>Slide 7 — Friendship Mapping with Four Conditions</w:t>
       </w:r>
     </w:p>
     <w:p>
@@ -494,7 +494,7 @@
         <w:ind w:left="216"/>
       </w:pPr>
       <w:r>
-        <w:t>4. Teach lightly — the cluster exercise does the depth work.</w:t>
+        <w:t>4. Teach lightly — the pairs exercise does the depth work.</w:t>
       </w:r>
     </w:p>
     <w:p>
@@ -574,7 +574,7 @@
         <w:ind w:left="216"/>
       </w:pPr>
       <w:r>
-        <w:t>3. Pray and send: same rooms; back at 8:08. Ten or fewer — stay one circle.</w:t>
+        <w:t>3. Pray and send: in pairs, right where you sit; back together at 8:08. Ten or fewer can also stay one circle.</w:t>
       </w:r>
     </w:p>
     <w:p>
@@ -589,7 +589,7 @@
         <w:t>SMALL ROOM:</w:t>
       </w:r>
       <w:r>
-        <w:t xml:space="preserve"> the split is only necessary if the room is large enough to need it. With six or so, stay one circle — or drop into quick pair work in place, knee to knee. Pair work is also the standing time-recovery lever: a full split-and-merge costs about five minutes.</w:t>
+        <w:t xml:space="preserve"> the split is only necessary if the room is large enough to need it. With six or so, stay one circle — or the quick pair work in place, knee to knee. Pair work is also the standing time-recovery lever: a full split-and-merge costs about five minutes.</w:t>
       </w:r>
     </w:p>
     <w:p>
@@ -604,7 +604,7 @@
         <w:t>CUES:</w:t>
       </w:r>
       <w:r>
-        <w:t xml:space="preserve"> In each cluster the Companion goes first on every condition, then the arranged parent opens; teens choose their own depth after; pass anytime.</w:t>
+        <w:t xml:space="preserve"> A leader models each condition first, then the arranged parent opens; teens choose their own depth after; pass anytime.</w:t>
       </w:r>
     </w:p>
     <w:p>

</xml_diff>

<commit_message>
v2.25 (John's word, 8 October): gentler Session 5 take-home (any relationship, offering not testing, an on-ramp if it stirs something hard, gratitude-shaped prep) across sheet, record, run sheet, page and deck; Session 6 Breakout Card (slide 87 on paper, one per group) with print cues in the notes; front page refreshed after the S6 debrief
Co-Authored-By: Claude Opus 5.5 <noreply@anthropic.com>
</commit_message>
<xml_diff>
--- a/_implementation-notes/evening-series/FotH Evening Session 5 Leader Notes DRAFT v1.docx
+++ b/_implementation-notes/evening-series/FotH Evening Session 5 Leader Notes DRAFT v1.docx
@@ -1572,7 +1572,7 @@
           <w:color w:val="2C5F2D"/>
           <w:sz w:val="24"/>
         </w:rPr>
-        <w:t xml:space="preserve">   The Homework Practice — One Friendship, One Condition</w:t>
+        <w:t xml:space="preserve">   The Homework Practice — One Relationship, One Condition</w:t>
       </w:r>
       <w:r>
         <w:rPr>
@@ -1646,7 +1646,7 @@
         <w:spacing w:before="0" w:after="60"/>
       </w:pPr>
       <w:r>
-        <w:t>1. Pick one friendship — yours alone, told to no one. Pick one condition: the most missing, or the hardest to offer.</w:t>
+        <w:t>1. Pick one relationship — a friend, a sibling, a parent, a teammate; not necessarily the closest; yours alone, told to no one. Pick one condition: the most missing, or the hardest to offer.</w:t>
       </w:r>
     </w:p>
     <w:p>
@@ -1668,7 +1668,7 @@
         <w:spacing w:before="0" w:after="60"/>
       </w:pPr>
       <w:r>
-        <w:t>3. Practice it more intentionally than usual over the two weeks — give the concrete versions: phone in another room for Present; receive without judging for Safe; name a carried thing for Clear; come in watching for what God is doing for Intentional.</w:t>
+        <w:t>3. Practice offering it more intentionally than usual over the two weeks — what you give, not a test of them; how they respond is not a grade on you — give the concrete versions: phone in another room for Present; receive without judging for Safe; name a carried thing for Clear; come in watching for what God is doing for Intentional.</w:t>
       </w:r>
     </w:p>
     <w:p>
@@ -1680,6 +1680,17 @@
       </w:pPr>
       <w:r>
         <w:t>4. The homework practice in writing: the Week 5 pages have journal prompts; H5.5 carries the practice. At the end of week one, report to your check-in partner.</w:t>
+      </w:r>
+    </w:p>
+    <w:p>
+      <w:pPr>
+        <w:pBdr>
+          <w:left w:val="double" w:sz="12" w:space="8" w:color="B45309"/>
+        </w:pBdr>
+        <w:spacing w:before="0" w:after="60"/>
+      </w:pPr>
+      <w:r>
+        <w:t>5. Say the on-ramp plainly, warmly: looking at friendships can bring up loneliness, a friendship that hurt, or one that faded. Notice it; don't fix it this week. Choose an easier relationship or set the practice down for a few days, and tell someone you trust — your partner, a parent, one of us. The sheet says it too.</w:t>
       </w:r>
     </w:p>
     <w:p>
@@ -1923,7 +1934,7 @@
         <w:spacing w:before="0" w:after="60"/>
       </w:pPr>
       <w:r>
-        <w:t>1. The four parts, in order: the homework practice, week one (one friendship, one condition); the end-of-week-one check-in; the homework practice, week two (same friendship, second condition — or deeper); one sentence of preparation.</w:t>
+        <w:t>1. The four parts, in order: the homework practice, week one (one relationship, one condition, offered — and the on-ramp if it stirs something hard); the end-of-week-one check-in; the homework practice, week two (same relationship or another, second condition — or deeper); one sentence of preparation.</w:t>
       </w:r>
     </w:p>
     <w:p>

</xml_diff>